<commit_message>
Replace Human-AI Learning Labs with weekly reading reflections
- Remove the in-class labs; Part VI is now a guide to the weekly reading
  reflections and the OB Theory Update
- Start paired readings in Week 2 (Simon 1991 and Bankins et al. 2023
  become optional background); nine reflections, best 8 of 9 count
- Shift 5% from reflections (25% -> 20%) to the Work Study final report
  (15% -> 20%); project now 40% of the grade
- Rebuild the Fall 2026 syllabus to match

Co-Authored-By: Claude Opus 5.5 <noreply@anthropic.com>
</commit_message>
<xml_diff>
--- a/syllabus/mgt_205_fall_2026_malik.docx
+++ b/syllabus/mgt_205_fall_2026_malik.docx
@@ -721,7 +721,7 @@
         <w:rPr>
           <w:i w:val="0"/>
         </w:rPr>
-        <w:t>In this course we survey research-based findings in organizational behavior—personality and attitudes, learning and perception, motivation, leadership, group decision making, teams, diversity, and culture—and examine how each changes when humans and AI jointly develop knowledge and make decisions. Students pair the textbook with classic and contemporary research, work with AI in weekly Human–AI Learning Labs, analyze Harvard Business School cases, and study a real organization's human–AI work practices in a team project.</w:t>
+        <w:t>In this course we survey research-based findings in organizational behavior—personality and attitudes, learning and perception, motivation, leadership, group decision making, teams, diversity, and culture—and examine how each changes when humans and AI jointly develop knowledge and make decisions. Students pair the textbook with classic and contemporary research, analyze Harvard Business School cases,  and study a real organization's human–AI work practices in a team project.</w:t>
       </w:r>
     </w:p>
     <w:p>
@@ -2026,7 +2026,7 @@
         <w:rPr>
           <w:i w:val="0"/>
         </w:rPr>
-        <w:t>Each week pairs a classic organizational behavior article with a contemporary article on AI at work, mainly from the Journal of Organizational Behavior, Academy of Management Journal, Administrative Science Quarterly, Journal of Management Studies, and Personnel Psychology. Reading names in the course schedule are links. Many of the AI articles are open access; the others open through Kettering library access.</w:t>
+        <w:t>Beginning in Week 2, each week pairs a classic organizational behavior article with a contemporary article on AI at work, mainly from the Journal of Organizational Behavior, Academy of Management Journal, Administrative Science Quarterly, Journal of Management Studies, and Personnel Psychology. Reading names in the course schedule are links. Many of the AI articles are open access; the others open through Kettering library access.</w:t>
       </w:r>
     </w:p>
     <w:p>
@@ -2042,7 +2042,7 @@
         <w:rPr>
           <w:i w:val="0"/>
         </w:rPr>
-        <w:t>Students will use a university-approved AI assistant (e.g., Claude, ChatGPT, Copilot, or Gemini) in the weekly Human–AI Learning Labs. No programming experience is required.</w:t>
+        <w:t>You may use a university-approved AI assistant (e.g., Claude, ChatGPT, Copilot, or Gemini) as a learning partner, following the AI policy below. No programming experience is required.</w:t>
       </w:r>
     </w:p>
     <w:p>
@@ -2279,34 +2279,12 @@
             <w:pPr>
               <w:spacing w:after="0" w:line="240" w:lineRule="auto"/>
             </w:pPr>
-            <w:hyperlink r:id="rId11">
-              <w:r>
-                <w:rPr>
-                  <w:rFonts w:ascii="Times New Roman" w:hAnsi="Times New Roman" w:eastAsia="Times New Roman" w:cs="Times New Roman"/>
-                  <w:color w:val="000000"/>
-                  <w:sz w:val="18"/>
-                  <w:u w:val="single"/>
-                </w:rPr>
-                <w:t xml:space="preserve">Simon (1991)</w:t>
-              </w:r>
-            </w:hyperlink>
             <w:r>
               <w:rPr>
                 <w:sz w:val="18"/>
               </w:rPr>
-              <w:t xml:space="preserve">; </w:t>
+              <w:t>—</w:t>
             </w:r>
-            <w:hyperlink r:id="rId12">
-              <w:r>
-                <w:rPr>
-                  <w:rFonts w:ascii="Times New Roman" w:hAnsi="Times New Roman" w:eastAsia="Times New Roman" w:cs="Times New Roman"/>
-                  <w:color w:val="000000"/>
-                  <w:sz w:val="18"/>
-                  <w:u w:val="single"/>
-                </w:rPr>
-                <w:t xml:space="preserve">Bankins et al. (2023)</w:t>
-              </w:r>
-            </w:hyperlink>
           </w:p>
         </w:tc>
         <w:tc>
@@ -2341,7 +2319,7 @@
                 <w:b w:val="0"/>
                 <w:sz w:val="18"/>
               </w:rPr>
-              <w:t>Lab 1; team proposal</w:t>
+              <w:t>Team proposal</w:t>
             </w:r>
           </w:p>
         </w:tc>
@@ -2417,7 +2395,7 @@
             <w:pPr>
               <w:spacing w:after="0" w:line="240" w:lineRule="auto"/>
             </w:pPr>
-            <w:hyperlink r:id="rId13">
+            <w:hyperlink r:id="rId11">
               <w:r>
                 <w:rPr>
                   <w:rFonts w:ascii="Times New Roman" w:hAnsi="Times New Roman" w:eastAsia="Times New Roman" w:cs="Times New Roman"/>
@@ -2434,7 +2412,7 @@
               </w:rPr>
               <w:t xml:space="preserve">; </w:t>
             </w:r>
-            <w:hyperlink r:id="rId14">
+            <w:hyperlink r:id="rId12">
               <w:r>
                 <w:rPr>
                   <w:rFonts w:ascii="Times New Roman" w:hAnsi="Times New Roman" w:eastAsia="Times New Roman" w:cs="Times New Roman"/>
@@ -2481,7 +2459,7 @@
                 <w:b w:val="0"/>
                 <w:sz w:val="18"/>
               </w:rPr>
-              <w:t>Lab 2; organization approved</w:t>
+              <w:t>Organization approved</w:t>
             </w:r>
           </w:p>
         </w:tc>
@@ -2553,7 +2531,7 @@
             <w:pPr>
               <w:spacing w:after="0" w:line="240" w:lineRule="auto"/>
             </w:pPr>
-            <w:hyperlink r:id="rId15">
+            <w:hyperlink r:id="rId13">
               <w:r>
                 <w:rPr>
                   <w:rFonts w:ascii="Times New Roman" w:hAnsi="Times New Roman" w:eastAsia="Times New Roman" w:cs="Times New Roman"/>
@@ -2570,7 +2548,7 @@
               </w:rPr>
               <w:t xml:space="preserve">; </w:t>
             </w:r>
-            <w:hyperlink r:id="rId16">
+            <w:hyperlink r:id="rId14">
               <w:r>
                 <w:rPr>
                   <w:rFonts w:ascii="Times New Roman" w:hAnsi="Times New Roman" w:eastAsia="Times New Roman" w:cs="Times New Roman"/>
@@ -2615,7 +2593,7 @@
                 <w:b w:val="0"/>
                 <w:sz w:val="18"/>
               </w:rPr>
-              <w:t>Lab 3; Milestone 1</w:t>
+              <w:t>Milestone 1</w:t>
             </w:r>
           </w:p>
         </w:tc>
@@ -2691,7 +2669,7 @@
             <w:pPr>
               <w:spacing w:after="0" w:line="240" w:lineRule="auto"/>
             </w:pPr>
-            <w:hyperlink r:id="rId17">
+            <w:hyperlink r:id="rId15">
               <w:r>
                 <w:rPr>
                   <w:rFonts w:ascii="Times New Roman" w:hAnsi="Times New Roman" w:eastAsia="Times New Roman" w:cs="Times New Roman"/>
@@ -2708,7 +2686,7 @@
               </w:rPr>
               <w:t xml:space="preserve">; </w:t>
             </w:r>
-            <w:hyperlink r:id="rId18">
+            <w:hyperlink r:id="rId16">
               <w:r>
                 <w:rPr>
                   <w:rFonts w:ascii="Times New Roman" w:hAnsi="Times New Roman" w:eastAsia="Times New Roman" w:cs="Times New Roman"/>
@@ -2755,7 +2733,7 @@
                 <w:b w:val="0"/>
                 <w:sz w:val="18"/>
               </w:rPr>
-              <w:t>Lab 4</w:t>
+              <w:t>—</w:t>
             </w:r>
           </w:p>
         </w:tc>
@@ -2827,7 +2805,7 @@
             <w:pPr>
               <w:spacing w:after="0" w:line="240" w:lineRule="auto"/>
             </w:pPr>
-            <w:hyperlink r:id="rId19">
+            <w:hyperlink r:id="rId17">
               <w:r>
                 <w:rPr>
                   <w:rFonts w:ascii="Times New Roman" w:hAnsi="Times New Roman" w:eastAsia="Times New Roman" w:cs="Times New Roman"/>
@@ -2844,7 +2822,7 @@
               </w:rPr>
               <w:t xml:space="preserve">; </w:t>
             </w:r>
-            <w:hyperlink r:id="rId20">
+            <w:hyperlink r:id="rId18">
               <w:r>
                 <w:rPr>
                   <w:rFonts w:ascii="Times New Roman" w:hAnsi="Times New Roman" w:eastAsia="Times New Roman" w:cs="Times New Roman"/>
@@ -2889,7 +2867,7 @@
                 <w:b w:val="0"/>
                 <w:sz w:val="18"/>
               </w:rPr>
-              <w:t>Lab 5; Midterm exam</w:t>
+              <w:t>Midterm exam</w:t>
             </w:r>
           </w:p>
         </w:tc>
@@ -2965,7 +2943,7 @@
             <w:pPr>
               <w:spacing w:after="0" w:line="240" w:lineRule="auto"/>
             </w:pPr>
-            <w:hyperlink r:id="rId21">
+            <w:hyperlink r:id="rId19">
               <w:r>
                 <w:rPr>
                   <w:rFonts w:ascii="Times New Roman" w:hAnsi="Times New Roman" w:eastAsia="Times New Roman" w:cs="Times New Roman"/>
@@ -2982,7 +2960,7 @@
               </w:rPr>
               <w:t xml:space="preserve">; </w:t>
             </w:r>
-            <w:hyperlink r:id="rId22">
+            <w:hyperlink r:id="rId20">
               <w:r>
                 <w:rPr>
                   <w:rFonts w:ascii="Times New Roman" w:hAnsi="Times New Roman" w:eastAsia="Times New Roman" w:cs="Times New Roman"/>
@@ -3029,7 +3007,7 @@
                 <w:b w:val="0"/>
                 <w:sz w:val="18"/>
               </w:rPr>
-              <w:t>Lab 6; Milestone 2</w:t>
+              <w:t>Milestone 2</w:t>
             </w:r>
           </w:p>
         </w:tc>
@@ -3101,7 +3079,7 @@
             <w:pPr>
               <w:spacing w:after="0" w:line="240" w:lineRule="auto"/>
             </w:pPr>
-            <w:hyperlink r:id="rId23">
+            <w:hyperlink r:id="rId21">
               <w:r>
                 <w:rPr>
                   <w:rFonts w:ascii="Times New Roman" w:hAnsi="Times New Roman" w:eastAsia="Times New Roman" w:cs="Times New Roman"/>
@@ -3118,7 +3096,7 @@
               </w:rPr>
               <w:t xml:space="preserve">; </w:t>
             </w:r>
-            <w:hyperlink r:id="rId24">
+            <w:hyperlink r:id="rId22">
               <w:r>
                 <w:rPr>
                   <w:rFonts w:ascii="Times New Roman" w:hAnsi="Times New Roman" w:eastAsia="Times New Roman" w:cs="Times New Roman"/>
@@ -3163,7 +3141,7 @@
                 <w:b w:val="0"/>
                 <w:sz w:val="18"/>
               </w:rPr>
-              <w:t>Lab 7</w:t>
+              <w:t>—</w:t>
             </w:r>
           </w:p>
         </w:tc>
@@ -3239,7 +3217,7 @@
             <w:pPr>
               <w:spacing w:after="0" w:line="240" w:lineRule="auto"/>
             </w:pPr>
-            <w:hyperlink r:id="rId25">
+            <w:hyperlink r:id="rId23">
               <w:r>
                 <w:rPr>
                   <w:rFonts w:ascii="Times New Roman" w:hAnsi="Times New Roman" w:eastAsia="Times New Roman" w:cs="Times New Roman"/>
@@ -3256,7 +3234,7 @@
               </w:rPr>
               <w:t xml:space="preserve">; </w:t>
             </w:r>
-            <w:hyperlink r:id="rId26">
+            <w:hyperlink r:id="rId24">
               <w:r>
                 <w:rPr>
                   <w:rFonts w:ascii="Times New Roman" w:hAnsi="Times New Roman" w:eastAsia="Times New Roman" w:cs="Times New Roman"/>
@@ -3303,7 +3281,7 @@
                 <w:b w:val="0"/>
                 <w:sz w:val="18"/>
               </w:rPr>
-              <w:t>Lab 8; Milestone 3</w:t>
+              <w:t>Milestone 3</w:t>
             </w:r>
           </w:p>
         </w:tc>
@@ -3375,7 +3353,7 @@
             <w:pPr>
               <w:spacing w:after="0" w:line="240" w:lineRule="auto"/>
             </w:pPr>
-            <w:hyperlink r:id="rId27">
+            <w:hyperlink r:id="rId25">
               <w:r>
                 <w:rPr>
                   <w:rFonts w:ascii="Times New Roman" w:hAnsi="Times New Roman" w:eastAsia="Times New Roman" w:cs="Times New Roman"/>
@@ -3392,7 +3370,7 @@
               </w:rPr>
               <w:t xml:space="preserve">; </w:t>
             </w:r>
-            <w:hyperlink r:id="rId28">
+            <w:hyperlink r:id="rId26">
               <w:r>
                 <w:rPr>
                   <w:rFonts w:ascii="Times New Roman" w:hAnsi="Times New Roman" w:eastAsia="Times New Roman" w:cs="Times New Roman"/>
@@ -3437,7 +3415,7 @@
                 <w:b w:val="0"/>
                 <w:sz w:val="18"/>
               </w:rPr>
-              <w:t>Lab 9; draft report</w:t>
+              <w:t>Draft report</w:t>
             </w:r>
           </w:p>
         </w:tc>
@@ -3513,7 +3491,7 @@
             <w:pPr>
               <w:spacing w:after="0" w:line="240" w:lineRule="auto"/>
             </w:pPr>
-            <w:hyperlink r:id="rId29">
+            <w:hyperlink r:id="rId27">
               <w:r>
                 <w:rPr>
                   <w:rFonts w:ascii="Times New Roman" w:hAnsi="Times New Roman" w:eastAsia="Times New Roman" w:cs="Times New Roman"/>
@@ -3530,7 +3508,7 @@
               </w:rPr>
               <w:t xml:space="preserve">; </w:t>
             </w:r>
-            <w:hyperlink r:id="rId30">
+            <w:hyperlink r:id="rId28">
               <w:r>
                 <w:rPr>
                   <w:rFonts w:ascii="Times New Roman" w:hAnsi="Times New Roman" w:eastAsia="Times New Roman" w:cs="Times New Roman"/>
@@ -3577,7 +3555,7 @@
                 <w:b w:val="0"/>
                 <w:sz w:val="18"/>
               </w:rPr>
-              <w:t>Lab 10; team presentations</w:t>
+              <w:t>Team presentations</w:t>
             </w:r>
           </w:p>
         </w:tc>
@@ -3699,6 +3677,14 @@
       <w:pPr>
         <w:spacing w:after="40"/>
       </w:pPr>
+    </w:p>
+    <w:p>
+      <w:r>
+        <w:rPr>
+          <w:i w:val="0"/>
+        </w:rPr>
+        <w:t>Weekly reading reflections are due in Weeks 2 through 10 (see Course Components).</w:t>
+      </w:r>
     </w:p>
     <w:p>
       <w:pPr>
@@ -4018,7 +4004,7 @@
         <w:pStyle w:val="Heading2"/>
       </w:pPr>
       <w:r>
-        <w:t>Human–AI Learning Labs and Weekly Reflections</w:t>
+        <w:t>Weekly Reading Reflections</w:t>
       </w:r>
     </w:p>
     <w:p>
@@ -4026,7 +4012,7 @@
         <w:rPr>
           <w:i w:val="0"/>
         </w:rPr>
-        <w:t>Each week includes a 30–40 minute in-class lab in which you complete an organizational behavior task together with an AI tool—for example, deciding when to trust AI advice, redesigning a job around an AI tool, or making a team decision with an AI information-pooler. After each lab you write a 400–600 word reflection with four parts: a lab log (what the AI contributed, what you contributed, and what changed), a connection to the week's readings, an OB Theory Update, and an AI disclosure. The Theory Update responds to the prompt:</w:t>
+        <w:t>Beginning in Week 2, each week pairs a classic organizational behavior article with a contemporary article on AI at work. After each week's readings you write a 400–600 word reflection with three parts: (1) a reading connection—what the classic theory explains, what it assumes about who knows and who decides, and what the AI study shows; (2) an OB Theory Update; and (3) an AI disclosure. The Theory Update responds to the prompt:</w:t>
       </w:r>
     </w:p>
     <w:p>
@@ -4045,7 +4031,7 @@
         <w:rPr>
           <w:i w:val="0"/>
         </w:rPr>
-        <w:t>Each reflection is scored out of 10; your best 9 of 10 count.</w:t>
+        <w:t>There are nine reflections (Weeks 2–10). Each is scored out of 10; your best 8 of 9 count.</w:t>
       </w:r>
     </w:p>
     <w:p>
@@ -4088,7 +4074,7 @@
         <w:rPr>
           <w:b/>
         </w:rPr>
-        <w:t xml:space="preserve">Final report (15%): </w:t>
+        <w:t xml:space="preserve">Final report (20%): </w:t>
       </w:r>
       <w:r>
         <w:t>no more than 8 pages, due in finals week, with a draft due in Week 9.</w:t>
@@ -4288,7 +4274,7 @@
                 <w:b w:val="0"/>
                 <w:sz w:val="20"/>
               </w:rPr>
-              <w:t>Weekly Human–AI Learning Reflections</w:t>
+              <w:t>Weekly Reading Reflections</w:t>
             </w:r>
           </w:p>
         </w:tc>
@@ -4308,7 +4294,7 @@
                 <w:b w:val="0"/>
                 <w:sz w:val="20"/>
               </w:rPr>
-              <w:t>25%</w:t>
+              <w:t>20%</w:t>
             </w:r>
           </w:p>
         </w:tc>
@@ -4436,7 +4422,7 @@
                 <w:b w:val="0"/>
                 <w:sz w:val="20"/>
               </w:rPr>
-              <w:t>15%</w:t>
+              <w:t>20%</w:t>
             </w:r>
           </w:p>
         </w:tc>
@@ -5581,7 +5567,7 @@
                 <w:b w:val="0"/>
                 <w:sz w:val="18"/>
               </w:rPr>
-              <w:t>Human–AI Learning Reflections</w:t>
+              <w:t>Weekly Reading Reflections</w:t>
             </w:r>
           </w:p>
         </w:tc>
@@ -6841,7 +6827,7 @@
         <w:rPr>
           <w:i w:val="0"/>
         </w:rPr>
-        <w:t>Weekly reflections are due before the start of the following week's first class. Exact dates and submission times are posted on the LMS.</w:t>
+        <w:t>Weekly reading reflections (Weeks 2–10) are due before the start of the following week's first class. Exact dates and submission times are posted on the LMS.</w:t>
       </w:r>
     </w:p>
     <w:p>
@@ -6865,7 +6851,7 @@
         <w:rPr>
           <w:i w:val="0"/>
         </w:rPr>
-        <w:t>In this course AI is both a subject of study and a learning partner. You are expected to use AI in the weekly labs and are welcome to use it to explain concepts, generate practice questions, brainstorm, and improve your writing. You remain responsible for everything you submit: verify AI output against the textbook and readings, cite only sources you have read, and include an AI disclosure statement in every reflection, memo, report, and presentation. Honest disclosure is never penalized.</w:t>
+        <w:t>In this course AI is both a subject of study and a learning partner. You are welcome to use AI to explain concepts, generate practice questions, brainstorm, and improve your writing. You remain responsible for everything you submit: verify AI output against the textbook and readings, cite only sources you have read, and include an AI disclosure statement in every reflection, memo, report, and presentation. Honest disclosure is never penalized.</w:t>
       </w:r>
     </w:p>
     <w:p>
@@ -6991,7 +6977,7 @@
       <w:r>
         <w:t xml:space="preserve">This syllabus is supported by the following course documents, available at </w:t>
       </w:r>
-      <w:hyperlink r:id="rId31">
+      <w:hyperlink r:id="rId29">
         <w:r>
           <w:rPr>
             <w:rFonts w:ascii="Times New Roman" w:hAnsi="Times New Roman" w:eastAsia="Times New Roman" w:cs="Times New Roman"/>
@@ -7072,7 +7058,7 @@
             <w:pPr>
               <w:spacing w:after="0" w:line="240" w:lineRule="auto"/>
             </w:pPr>
-            <w:hyperlink r:id="rId32">
+            <w:hyperlink r:id="rId30">
               <w:r>
                 <w:rPr>
                   <w:rFonts w:ascii="Times New Roman" w:hAnsi="Times New Roman" w:eastAsia="Times New Roman" w:cs="Times New Roman"/>
@@ -7117,7 +7103,7 @@
             <w:pPr>
               <w:spacing w:after="0" w:line="240" w:lineRule="auto"/>
             </w:pPr>
-            <w:hyperlink r:id="rId33">
+            <w:hyperlink r:id="rId31">
               <w:r>
                 <w:rPr>
                   <w:rFonts w:ascii="Times New Roman" w:hAnsi="Times New Roman" w:eastAsia="Times New Roman" w:cs="Times New Roman"/>
@@ -7162,7 +7148,7 @@
             <w:pPr>
               <w:spacing w:after="0" w:line="240" w:lineRule="auto"/>
             </w:pPr>
-            <w:hyperlink r:id="rId34">
+            <w:hyperlink r:id="rId32">
               <w:r>
                 <w:rPr>
                   <w:rFonts w:ascii="Times New Roman" w:hAnsi="Times New Roman" w:eastAsia="Times New Roman" w:cs="Times New Roman"/>
@@ -7207,7 +7193,7 @@
             <w:pPr>
               <w:spacing w:after="0" w:line="240" w:lineRule="auto"/>
             </w:pPr>
-            <w:hyperlink r:id="rId35">
+            <w:hyperlink r:id="rId33">
               <w:r>
                 <w:rPr>
                   <w:rFonts w:ascii="Times New Roman" w:hAnsi="Times New Roman" w:eastAsia="Times New Roman" w:cs="Times New Roman"/>
@@ -7252,7 +7238,7 @@
             <w:pPr>
               <w:spacing w:after="0" w:line="240" w:lineRule="auto"/>
             </w:pPr>
-            <w:hyperlink r:id="rId36">
+            <w:hyperlink r:id="rId34">
               <w:r>
                 <w:rPr>
                   <w:rFonts w:ascii="Times New Roman" w:hAnsi="Times New Roman" w:eastAsia="Times New Roman" w:cs="Times New Roman"/>
@@ -7297,7 +7283,7 @@
             <w:pPr>
               <w:spacing w:after="0" w:line="240" w:lineRule="auto"/>
             </w:pPr>
-            <w:hyperlink r:id="rId37">
+            <w:hyperlink r:id="rId35">
               <w:r>
                 <w:rPr>
                   <w:rFonts w:ascii="Times New Roman" w:hAnsi="Times New Roman" w:eastAsia="Times New Roman" w:cs="Times New Roman"/>
@@ -7342,7 +7328,7 @@
             <w:pPr>
               <w:spacing w:after="0" w:line="240" w:lineRule="auto"/>
             </w:pPr>
-            <w:hyperlink r:id="rId38">
+            <w:hyperlink r:id="rId36">
               <w:r>
                 <w:rPr>
                   <w:rFonts w:ascii="Times New Roman" w:hAnsi="Times New Roman" w:eastAsia="Times New Roman" w:cs="Times New Roman"/>
@@ -7350,7 +7336,7 @@
                   <w:sz w:val="20"/>
                   <w:u w:val="single"/>
                 </w:rPr>
-                <w:t xml:space="preserve">Part VI – Human–AI Learning Labs</w:t>
+                <w:t xml:space="preserve">Part VI – Weekly Reading Reflections</w:t>
               </w:r>
             </w:hyperlink>
           </w:p>
@@ -7369,7 +7355,7 @@
                 <w:b w:val="0"/>
                 <w:sz w:val="20"/>
               </w:rPr>
-              <w:t>Weekly lab exercises and reflection design</w:t>
+              <w:t>Reflection design and the OB Theory Update</w:t>
             </w:r>
           </w:p>
         </w:tc>
@@ -7387,7 +7373,7 @@
             <w:pPr>
               <w:spacing w:after="0" w:line="240" w:lineRule="auto"/>
             </w:pPr>
-            <w:hyperlink r:id="rId39">
+            <w:hyperlink r:id="rId37">
               <w:r>
                 <w:rPr>
                   <w:rFonts w:ascii="Times New Roman" w:hAnsi="Times New Roman" w:eastAsia="Times New Roman" w:cs="Times New Roman"/>
@@ -7432,7 +7418,7 @@
             <w:pPr>
               <w:spacing w:after="0" w:line="240" w:lineRule="auto"/>
             </w:pPr>
-            <w:hyperlink r:id="rId40">
+            <w:hyperlink r:id="rId38">
               <w:r>
                 <w:rPr>
                   <w:rFonts w:ascii="Times New Roman" w:hAnsi="Times New Roman" w:eastAsia="Times New Roman" w:cs="Times New Roman"/>
@@ -7477,7 +7463,7 @@
             <w:pPr>
               <w:spacing w:after="0" w:line="240" w:lineRule="auto"/>
             </w:pPr>
-            <w:hyperlink r:id="rId41">
+            <w:hyperlink r:id="rId39">
               <w:r>
                 <w:rPr>
                   <w:rFonts w:ascii="Times New Roman" w:hAnsi="Times New Roman" w:eastAsia="Times New Roman" w:cs="Times New Roman"/>
@@ -7522,7 +7508,7 @@
             <w:pPr>
               <w:spacing w:after="0" w:line="240" w:lineRule="auto"/>
             </w:pPr>
-            <w:hyperlink r:id="rId42">
+            <w:hyperlink r:id="rId40">
               <w:r>
                 <w:rPr>
                   <w:rFonts w:ascii="Times New Roman" w:hAnsi="Times New Roman" w:eastAsia="Times New Roman" w:cs="Times New Roman"/>

</xml_diff>